<commit_message>
Mod: completato documento DBI_EWMS, aggiornati ODD e SDD per essere aggiornati con il progetto
</commit_message>
<xml_diff>
--- a/Workspace/SDD/DBI_EWMS.docx
+++ b/Workspace/SDD/DBI_EWMS.docx
@@ -126,6 +126,7 @@
         </w:rPr>
         <w:br/>
       </w:r>
+      <w:proofErr w:type="spellStart"/>
       <w:r>
         <w:rPr>
           <w:rFonts w:ascii="Arial" w:hAnsi="Arial"/>
@@ -133,8 +134,9 @@
           <w:sz w:val="36"/>
           <w:lang w:val="en-GB"/>
         </w:rPr>
-        <w:t>DataBase Informations</w:t>
-      </w:r>
+        <w:t>DataBase</w:t>
+      </w:r>
+      <w:proofErr w:type="spellEnd"/>
       <w:r>
         <w:rPr>
           <w:rFonts w:ascii="Arial" w:hAnsi="Arial"/>
@@ -142,8 +144,47 @@
           <w:sz w:val="36"/>
           <w:lang w:val="en-GB"/>
         </w:rPr>
+        <w:t xml:space="preserve"> </w:t>
+      </w:r>
+      <w:proofErr w:type="spellStart"/>
+      <w:r>
+        <w:rPr>
+          <w:rFonts w:ascii="Arial" w:hAnsi="Arial"/>
+          <w:b/>
+          <w:sz w:val="36"/>
+          <w:lang w:val="en-GB"/>
+        </w:rPr>
+        <w:t>Informations</w:t>
+      </w:r>
+      <w:proofErr w:type="spellEnd"/>
+      <w:r>
+        <w:rPr>
+          <w:rFonts w:ascii="Arial" w:hAnsi="Arial"/>
+          <w:b/>
+          <w:sz w:val="36"/>
+          <w:lang w:val="en-GB"/>
+        </w:rPr>
         <w:br/>
-        <w:t xml:space="preserve">Versione </w:t>
+      </w:r>
+      <w:proofErr w:type="spellStart"/>
+      <w:r>
+        <w:rPr>
+          <w:rFonts w:ascii="Arial" w:hAnsi="Arial"/>
+          <w:b/>
+          <w:sz w:val="36"/>
+          <w:lang w:val="en-GB"/>
+        </w:rPr>
+        <w:t>Versione</w:t>
+      </w:r>
+      <w:proofErr w:type="spellEnd"/>
+      <w:r>
+        <w:rPr>
+          <w:rFonts w:ascii="Arial" w:hAnsi="Arial"/>
+          <w:b/>
+          <w:sz w:val="36"/>
+          <w:lang w:val="en-GB"/>
+        </w:rPr>
+        <w:t xml:space="preserve"> </w:t>
       </w:r>
       <w:r>
         <w:rPr>
@@ -1013,13 +1054,23 @@
           <w:sz w:val="32"/>
         </w:rPr>
       </w:pPr>
+      <w:proofErr w:type="spellStart"/>
       <w:r>
         <w:rPr>
           <w:rFonts w:cs="Times New Roman"/>
           <w:b/>
           <w:sz w:val="32"/>
         </w:rPr>
-        <w:t>Revision History</w:t>
+        <w:t>Revision</w:t>
+      </w:r>
+      <w:proofErr w:type="spellEnd"/>
+      <w:r>
+        <w:rPr>
+          <w:rFonts w:cs="Times New Roman"/>
+          <w:b/>
+          <w:sz w:val="32"/>
+        </w:rPr>
+        <w:t xml:space="preserve"> History</w:t>
       </w:r>
       <w:r>
         <w:rPr>
@@ -1205,7 +1256,19 @@
               <w:rPr>
                 <w:sz w:val="20"/>
               </w:rPr>
-              <w:t>1.0</w:t>
+              <w:t>0</w:t>
+            </w:r>
+            <w:r>
+              <w:rPr>
+                <w:sz w:val="20"/>
+              </w:rPr>
+              <w:t>.</w:t>
+            </w:r>
+            <w:r>
+              <w:rPr>
+                <w:sz w:val="20"/>
+              </w:rPr>
+              <w:t>5</w:t>
             </w:r>
           </w:p>
         </w:tc>
@@ -1229,7 +1292,7 @@
               <w:rPr>
                 <w:sz w:val="20"/>
               </w:rPr>
-              <w:t>Descritte le tabelle presenti all’interno del database ewmsdb</w:t>
+              <w:t xml:space="preserve">Introduzione al documento, inizio descrizione tabelle </w:t>
             </w:r>
           </w:p>
         </w:tc>
@@ -1280,6 +1343,12 @@
                 <w:sz w:val="20"/>
               </w:rPr>
             </w:pPr>
+            <w:r>
+              <w:rPr>
+                <w:sz w:val="20"/>
+              </w:rPr>
+              <w:t>22/01/2026</w:t>
+            </w:r>
           </w:p>
         </w:tc>
         <w:tc>
@@ -1299,6 +1368,12 @@
                 <w:sz w:val="20"/>
               </w:rPr>
             </w:pPr>
+            <w:r>
+              <w:rPr>
+                <w:sz w:val="20"/>
+              </w:rPr>
+              <w:t>1.0</w:t>
+            </w:r>
           </w:p>
         </w:tc>
         <w:tc>
@@ -1313,7 +1388,96 @@
           <w:p>
             <w:pPr>
               <w:pStyle w:val="Contenutotabella"/>
-              <w:jc w:val="center"/>
+              <w:rPr>
+                <w:sz w:val="20"/>
+              </w:rPr>
+            </w:pPr>
+            <w:r>
+              <w:rPr>
+                <w:sz w:val="20"/>
+              </w:rPr>
+              <w:t>Completamento stesura documento</w:t>
+            </w:r>
+          </w:p>
+        </w:tc>
+        <w:tc>
+          <w:tcPr>
+            <w:tcW w:w="2410" w:type="dxa"/>
+            <w:vMerge w:val="restart"/>
+            <w:tcBorders>
+              <w:left w:val="single" w:sz="1" w:space="0" w:color="000000"/>
+              <w:bottom w:val="single" w:sz="1" w:space="0" w:color="000000"/>
+              <w:right w:val="single" w:sz="1" w:space="0" w:color="000000"/>
+            </w:tcBorders>
+          </w:tcPr>
+          <w:p>
+            <w:pPr>
+              <w:pStyle w:val="Contenutotabella"/>
+              <w:rPr>
+                <w:sz w:val="20"/>
+              </w:rPr>
+            </w:pPr>
+            <w:r>
+              <w:rPr>
+                <w:sz w:val="20"/>
+              </w:rPr>
+              <w:t>Giovanni Robustelli</w:t>
+            </w:r>
+          </w:p>
+        </w:tc>
+      </w:tr>
+      <w:tr>
+        <w:trPr>
+          <w:trHeight w:val="230"/>
+        </w:trPr>
+        <w:tc>
+          <w:tcPr>
+            <w:tcW w:w="1927" w:type="dxa"/>
+            <w:vMerge w:val="restart"/>
+            <w:tcBorders>
+              <w:left w:val="single" w:sz="1" w:space="0" w:color="000000"/>
+              <w:bottom w:val="single" w:sz="1" w:space="0" w:color="000000"/>
+            </w:tcBorders>
+          </w:tcPr>
+          <w:p>
+            <w:pPr>
+              <w:pStyle w:val="Contenutotabella"/>
+              <w:rPr>
+                <w:sz w:val="20"/>
+              </w:rPr>
+            </w:pPr>
+          </w:p>
+        </w:tc>
+        <w:tc>
+          <w:tcPr>
+            <w:tcW w:w="964" w:type="dxa"/>
+            <w:vMerge w:val="restart"/>
+            <w:tcBorders>
+              <w:left w:val="single" w:sz="1" w:space="0" w:color="000000"/>
+              <w:bottom w:val="single" w:sz="1" w:space="0" w:color="000000"/>
+            </w:tcBorders>
+          </w:tcPr>
+          <w:p>
+            <w:pPr>
+              <w:pStyle w:val="Contenutotabella"/>
+              <w:rPr>
+                <w:sz w:val="20"/>
+              </w:rPr>
+            </w:pPr>
+          </w:p>
+        </w:tc>
+        <w:tc>
+          <w:tcPr>
+            <w:tcW w:w="4336" w:type="dxa"/>
+            <w:vMerge w:val="restart"/>
+            <w:tcBorders>
+              <w:left w:val="single" w:sz="1" w:space="0" w:color="000000"/>
+              <w:bottom w:val="single" w:sz="1" w:space="0" w:color="000000"/>
+            </w:tcBorders>
+          </w:tcPr>
+          <w:p>
+            <w:pPr>
+              <w:pStyle w:val="Contenutotabella"/>
               <w:rPr>
                 <w:sz w:val="20"/>
               </w:rPr>
@@ -1333,7 +1497,6 @@
           <w:p>
             <w:pPr>
               <w:pStyle w:val="Contenutotabella"/>
-              <w:jc w:val="center"/>
               <w:rPr>
                 <w:sz w:val="20"/>
               </w:rPr>
@@ -1653,84 +1816,6 @@
           </w:p>
         </w:tc>
       </w:tr>
-      <w:tr>
-        <w:trPr>
-          <w:trHeight w:val="230"/>
-        </w:trPr>
-        <w:tc>
-          <w:tcPr>
-            <w:tcW w:w="1927" w:type="dxa"/>
-            <w:vMerge w:val="restart"/>
-            <w:tcBorders>
-              <w:left w:val="single" w:sz="1" w:space="0" w:color="000000"/>
-              <w:bottom w:val="single" w:sz="1" w:space="0" w:color="000000"/>
-            </w:tcBorders>
-          </w:tcPr>
-          <w:p>
-            <w:pPr>
-              <w:pStyle w:val="Contenutotabella"/>
-              <w:rPr>
-                <w:sz w:val="20"/>
-              </w:rPr>
-            </w:pPr>
-          </w:p>
-        </w:tc>
-        <w:tc>
-          <w:tcPr>
-            <w:tcW w:w="964" w:type="dxa"/>
-            <w:vMerge w:val="restart"/>
-            <w:tcBorders>
-              <w:left w:val="single" w:sz="1" w:space="0" w:color="000000"/>
-              <w:bottom w:val="single" w:sz="1" w:space="0" w:color="000000"/>
-            </w:tcBorders>
-          </w:tcPr>
-          <w:p>
-            <w:pPr>
-              <w:pStyle w:val="Contenutotabella"/>
-              <w:rPr>
-                <w:sz w:val="20"/>
-              </w:rPr>
-            </w:pPr>
-          </w:p>
-        </w:tc>
-        <w:tc>
-          <w:tcPr>
-            <w:tcW w:w="4336" w:type="dxa"/>
-            <w:vMerge w:val="restart"/>
-            <w:tcBorders>
-              <w:left w:val="single" w:sz="1" w:space="0" w:color="000000"/>
-              <w:bottom w:val="single" w:sz="1" w:space="0" w:color="000000"/>
-            </w:tcBorders>
-          </w:tcPr>
-          <w:p>
-            <w:pPr>
-              <w:pStyle w:val="Contenutotabella"/>
-              <w:rPr>
-                <w:sz w:val="20"/>
-              </w:rPr>
-            </w:pPr>
-          </w:p>
-        </w:tc>
-        <w:tc>
-          <w:tcPr>
-            <w:tcW w:w="2410" w:type="dxa"/>
-            <w:vMerge w:val="restart"/>
-            <w:tcBorders>
-              <w:left w:val="single" w:sz="1" w:space="0" w:color="000000"/>
-              <w:bottom w:val="single" w:sz="1" w:space="0" w:color="000000"/>
-              <w:right w:val="single" w:sz="1" w:space="0" w:color="000000"/>
-            </w:tcBorders>
-          </w:tcPr>
-          <w:p>
-            <w:pPr>
-              <w:pStyle w:val="Contenutotabella"/>
-              <w:rPr>
-                <w:sz w:val="20"/>
-              </w:rPr>
-            </w:pPr>
-          </w:p>
-        </w:tc>
-      </w:tr>
     </w:tbl>
     <w:p>
       <w:pPr>
@@ -1793,31 +1878,16 @@
       </w:pPr>
     </w:p>
     <w:p>
-      <w:r>
-        <w:fldChar w:fldCharType="begin"/>
-      </w:r>
-      <w:r>
-        <w:instrText xml:space="preserve"> TOC \o "1-3" \h \z \u </w:instrText>
-      </w:r>
-      <w:r>
-        <w:fldChar w:fldCharType="separate"/>
-      </w:r>
-      <w:r>
-        <w:rPr>
-          <w:b/>
-          <w:bCs/>
-          <w:noProof/>
-        </w:rPr>
-        <w:t>Nessuna voce di sommario trovata.</w:t>
-      </w:r>
-      <w:r>
-        <w:rPr>
-          <w:b/>
-          <w:bCs/>
-          <w:noProof/>
-        </w:rPr>
-        <w:fldChar w:fldCharType="end"/>
-      </w:r>
+      <w:fldSimple w:instr=" TOC \o &quot;1-3&quot; \h \z \u ">
+        <w:r>
+          <w:rPr>
+            <w:b/>
+            <w:bCs/>
+            <w:noProof/>
+          </w:rPr>
+          <w:t>Nessuna voce di sommario trovata.</w:t>
+        </w:r>
+      </w:fldSimple>
     </w:p>
     <w:p>
       <w:pPr>
@@ -1896,10 +1966,7 @@
         <w:t>d</w:t>
       </w:r>
       <w:r>
-        <w:t>iagramma ER</w:t>
-      </w:r>
-      <w:r>
-        <w:t xml:space="preserve">, viene illustrato come le informazioni siano organizzate all'interno del </w:t>
+        <w:t xml:space="preserve">iagramma ER, viene illustrato come le informazioni siano organizzate all'interno del </w:t>
       </w:r>
       <w:r>
         <w:t>d</w:t>
@@ -1918,11 +1985,16 @@
       <w:r>
         <w:t xml:space="preserve">Questa documentazione rappresenta il punto di riferimento essenziale per lo sviluppo del </w:t>
       </w:r>
+      <w:proofErr w:type="spellStart"/>
       <w:r>
         <w:t>b</w:t>
       </w:r>
       <w:r>
-        <w:t xml:space="preserve">ackend, facilitando l'implementazione dello </w:t>
+        <w:t>ackend</w:t>
+      </w:r>
+      <w:proofErr w:type="spellEnd"/>
+      <w:r>
+        <w:t xml:space="preserve">, facilitando l'implementazione dello </w:t>
       </w:r>
       <w:r>
         <w:t>s</w:t>
@@ -1930,11 +2002,16 @@
       <w:r>
         <w:t xml:space="preserve">chema e le future attività di </w:t>
       </w:r>
+      <w:proofErr w:type="spellStart"/>
       <w:r>
         <w:t>m</w:t>
       </w:r>
       <w:r>
-        <w:t xml:space="preserve">aintenance </w:t>
+        <w:t>aintenance</w:t>
+      </w:r>
+      <w:proofErr w:type="spellEnd"/>
+      <w:r>
+        <w:t xml:space="preserve"> </w:t>
       </w:r>
       <w:r>
         <w:t xml:space="preserve">o evoluzione </w:t>
@@ -2014,6 +2091,9 @@
       </w:pPr>
       <w:r>
         <w:lastRenderedPageBreak/>
+        <w:t xml:space="preserve">2.1 </w:t>
+      </w:r>
+      <w:r>
         <w:t>Descrizione tabelle</w:t>
       </w:r>
     </w:p>
@@ -2022,6 +2102,9 @@
       <w:pPr>
         <w:pStyle w:val="Titolo3"/>
       </w:pPr>
+      <w:r>
+        <w:t xml:space="preserve">2.1.1 </w:t>
+      </w:r>
       <w:r>
         <w:t>Utente</w:t>
       </w:r>
@@ -2062,12 +2145,21 @@
           <w:numId w:val="10"/>
         </w:numPr>
       </w:pPr>
+      <w:proofErr w:type="gramStart"/>
       <w:r>
         <w:rPr>
           <w:b/>
           <w:bCs/>
         </w:rPr>
-        <w:t>Email:</w:t>
+        <w:t>Email</w:t>
+      </w:r>
+      <w:proofErr w:type="gramEnd"/>
+      <w:r>
+        <w:rPr>
+          <w:b/>
+          <w:bCs/>
+        </w:rPr>
+        <w:t>:</w:t>
       </w:r>
       <w:r>
         <w:t xml:space="preserve"> indirizzo utilizzato per effettuare il login all’interno del sistema, preferibile rispetto all’utilizzo della matricola (difficile da ricordare), per questo anche questo campo è unico. </w:t>
@@ -2100,15 +2192,29 @@
           <w:numId w:val="10"/>
         </w:numPr>
       </w:pPr>
+      <w:proofErr w:type="spellStart"/>
       <w:r>
         <w:rPr>
           <w:b/>
           <w:bCs/>
         </w:rPr>
-        <w:t xml:space="preserve">HashPassword: </w:t>
-      </w:r>
-      <w:r>
-        <w:t xml:space="preserve">hash della password dell’utente, </w:t>
+        <w:t>HashPassword</w:t>
+      </w:r>
+      <w:proofErr w:type="spellEnd"/>
+      <w:r>
+        <w:rPr>
+          <w:b/>
+          <w:bCs/>
+        </w:rPr>
+        <w:t xml:space="preserve">: </w:t>
+      </w:r>
+      <w:proofErr w:type="spellStart"/>
+      <w:r>
+        <w:t>hash</w:t>
+      </w:r>
+      <w:proofErr w:type="spellEnd"/>
+      <w:r>
+        <w:t xml:space="preserve"> della password dell’utente, </w:t>
       </w:r>
       <w:r>
         <w:t>questo campo è utilizzato per l’autenticazione all’interno del sistema.</w:t>
@@ -2122,18 +2228,67 @@
           <w:numId w:val="10"/>
         </w:numPr>
       </w:pPr>
+      <w:proofErr w:type="spellStart"/>
       <w:r>
         <w:rPr>
           <w:b/>
           <w:bCs/>
         </w:rPr>
-        <w:t>newUtente:</w:t>
-      </w:r>
-      <w:r>
-        <w:t xml:space="preserve"> boolean </w:t>
-      </w:r>
-      <w:r>
-        <w:t>utilizzato per fare controllare se l’utente è nuovo e quindi se ha bisogno di reimpostare la password. Questo boolean è settato di default su true, verrà cambiato a false una volta che l’utente ha modificato la password. In caso vi è il rimpiazzo da parte del Gestore degli Account della password dell’utente, allora sarà necessario reinserirla e newUtente sarà reimpostato a true.</w:t>
+        <w:t>newUtente</w:t>
+      </w:r>
+      <w:proofErr w:type="spellEnd"/>
+      <w:r>
+        <w:rPr>
+          <w:b/>
+          <w:bCs/>
+        </w:rPr>
+        <w:t>:</w:t>
+      </w:r>
+      <w:r>
+        <w:t xml:space="preserve"> </w:t>
+      </w:r>
+      <w:proofErr w:type="spellStart"/>
+      <w:r>
+        <w:t>boolean</w:t>
+      </w:r>
+      <w:proofErr w:type="spellEnd"/>
+      <w:r>
+        <w:t xml:space="preserve"> </w:t>
+      </w:r>
+      <w:r>
+        <w:t xml:space="preserve">utilizzato per fare controllare se l’utente è nuovo e quindi se ha bisogno di reimpostare la password. Questo </w:t>
+      </w:r>
+      <w:proofErr w:type="spellStart"/>
+      <w:r>
+        <w:t>boolean</w:t>
+      </w:r>
+      <w:proofErr w:type="spellEnd"/>
+      <w:r>
+        <w:t xml:space="preserve"> è settato di default su </w:t>
+      </w:r>
+      <w:proofErr w:type="spellStart"/>
+      <w:r>
+        <w:t>true</w:t>
+      </w:r>
+      <w:proofErr w:type="spellEnd"/>
+      <w:r>
+        <w:t xml:space="preserve">, verrà cambiato a false una volta che l’utente ha modificato la password. In caso vi è il rimpiazzo da parte del Gestore degli Account della password dell’utente, allora sarà necessario reinserirla e </w:t>
+      </w:r>
+      <w:proofErr w:type="spellStart"/>
+      <w:r>
+        <w:t>newUtente</w:t>
+      </w:r>
+      <w:proofErr w:type="spellEnd"/>
+      <w:r>
+        <w:t xml:space="preserve"> sarà reimpostato a </w:t>
+      </w:r>
+      <w:proofErr w:type="spellStart"/>
+      <w:r>
+        <w:t>true</w:t>
+      </w:r>
+      <w:proofErr w:type="spellEnd"/>
+      <w:r>
+        <w:t>.</w:t>
       </w:r>
     </w:p>
     <w:p>
@@ -2155,23 +2310,626 @@
         <w:t>:</w:t>
       </w:r>
       <w:r>
-        <w:t xml:space="preserve"> è utilizzato per risparmiare connessioni al db, nel caso di check per il ruolo di un utente</w:t>
+        <w:t xml:space="preserve"> è utilizzato per risparmiare connessioni al </w:t>
+      </w:r>
+      <w:proofErr w:type="spellStart"/>
+      <w:r>
+        <w:t>db</w:t>
+      </w:r>
+      <w:proofErr w:type="spellEnd"/>
+      <w:r>
+        <w:t>, nel caso di check per il ruolo di un utente</w:t>
+      </w:r>
+    </w:p>
+    <w:p>
+      <w:pPr>
+        <w:rPr>
+          <w:b/>
+          <w:bCs/>
+        </w:rPr>
+      </w:pPr>
+    </w:p>
+    <w:p>
+      <w:r>
+        <w:t xml:space="preserve">La tabella utente si specializza in tre tabelle: </w:t>
+      </w:r>
+      <w:proofErr w:type="spellStart"/>
+      <w:r>
+        <w:t>GestoreDegliAccount</w:t>
+      </w:r>
+      <w:proofErr w:type="spellEnd"/>
+      <w:r>
+        <w:t>, Supervisore e dipendente. La tabella</w:t>
+      </w:r>
+      <w:r>
+        <w:t xml:space="preserve"> </w:t>
+      </w:r>
+      <w:r>
+        <w:t xml:space="preserve">del gestore, tuttavia, è solo una specializzazione teorica, a livello di implementazione non avrà effettivamente una tabella dedicata. Per le tabelle supervisore e dipendente, la tabella </w:t>
+      </w:r>
+      <w:r>
+        <w:t>supervisore</w:t>
+      </w:r>
+      <w:r>
+        <w:t xml:space="preserve"> </w:t>
+      </w:r>
+      <w:r>
+        <w:t>ha una relazione one-to-</w:t>
+      </w:r>
+      <w:proofErr w:type="spellStart"/>
+      <w:r>
+        <w:t>many</w:t>
+      </w:r>
+      <w:proofErr w:type="spellEnd"/>
+      <w:r>
+        <w:t xml:space="preserve"> con </w:t>
+      </w:r>
+      <w:r>
+        <w:t>dipendente</w:t>
+      </w:r>
+      <w:r>
+        <w:t xml:space="preserve">: nella tabella dipendente avremo quindi una </w:t>
+      </w:r>
+      <w:proofErr w:type="spellStart"/>
+      <w:r>
+        <w:t>foreign</w:t>
+      </w:r>
+      <w:proofErr w:type="spellEnd"/>
+      <w:r>
+        <w:t xml:space="preserve"> key che punta alla tabella supervisore.</w:t>
+      </w:r>
+    </w:p>
+    <w:p/>
+    <w:p/>
+    <w:p>
+      <w:pPr>
+        <w:pStyle w:val="Titolo3"/>
+        <w:numPr>
+          <w:ilvl w:val="2"/>
+          <w:numId w:val="8"/>
+        </w:numPr>
+        <w:ind w:left="709"/>
+      </w:pPr>
+      <w:r>
+        <w:t>Task</w:t>
+      </w:r>
+    </w:p>
+    <w:p/>
+    <w:p>
+      <w:r>
+        <w:t>Task è la tabella che permette la permanenza dei task assegnati dai supervisori ai dipendenti all’interno del sistema. Questa tabella è l’altro tassello principale del sistema EWMS.</w:t>
+      </w:r>
+    </w:p>
+    <w:p>
+      <w:r>
+        <w:t xml:space="preserve">Contiene: </w:t>
       </w:r>
     </w:p>
     <w:p>
       <w:pPr>
         <w:pStyle w:val="Paragrafoelenco"/>
+        <w:numPr>
+          <w:ilvl w:val="0"/>
+          <w:numId w:val="10"/>
+        </w:numPr>
+      </w:pPr>
+      <w:r>
         <w:rPr>
           <w:b/>
           <w:bCs/>
         </w:rPr>
-      </w:pPr>
-    </w:p>
-    <w:p>
-      <w:pPr>
-        <w:ind w:left="-142"/>
-      </w:pPr>
-    </w:p>
+        <w:t>Id</w:t>
+      </w:r>
+      <w:r>
+        <w:t>: identificativo unico del task generato in automatico dal database</w:t>
+      </w:r>
+    </w:p>
+    <w:p>
+      <w:pPr>
+        <w:pStyle w:val="Paragrafoelenco"/>
+        <w:numPr>
+          <w:ilvl w:val="0"/>
+          <w:numId w:val="10"/>
+        </w:numPr>
+      </w:pPr>
+      <w:r>
+        <w:rPr>
+          <w:b/>
+          <w:bCs/>
+        </w:rPr>
+        <w:lastRenderedPageBreak/>
+        <w:t>Titolo</w:t>
+      </w:r>
+      <w:r>
+        <w:t>:</w:t>
+      </w:r>
+      <w:r>
+        <w:t xml:space="preserve"> permette l’inserimento del titolo del singolo task, utile al supervisore per inserire informazioni cruciali del task, che andrà a specificare all’interno del task stesso</w:t>
+      </w:r>
+    </w:p>
+    <w:p>
+      <w:pPr>
+        <w:pStyle w:val="Paragrafoelenco"/>
+        <w:numPr>
+          <w:ilvl w:val="0"/>
+          <w:numId w:val="10"/>
+        </w:numPr>
+      </w:pPr>
+      <w:proofErr w:type="spellStart"/>
+      <w:r>
+        <w:rPr>
+          <w:b/>
+          <w:bCs/>
+        </w:rPr>
+        <w:t>DataDiCreazione</w:t>
+      </w:r>
+      <w:proofErr w:type="spellEnd"/>
+      <w:r>
+        <w:t>:</w:t>
+      </w:r>
+      <w:r>
+        <w:t xml:space="preserve"> specifica quando il task è stato assegnato</w:t>
+      </w:r>
+    </w:p>
+    <w:p>
+      <w:pPr>
+        <w:pStyle w:val="Paragrafoelenco"/>
+        <w:numPr>
+          <w:ilvl w:val="0"/>
+          <w:numId w:val="10"/>
+        </w:numPr>
+      </w:pPr>
+      <w:proofErr w:type="spellStart"/>
+      <w:r>
+        <w:rPr>
+          <w:b/>
+          <w:bCs/>
+        </w:rPr>
+        <w:t>DataDiScadenza</w:t>
+      </w:r>
+      <w:proofErr w:type="spellEnd"/>
+      <w:r>
+        <w:t>:</w:t>
+      </w:r>
+      <w:r>
+        <w:t xml:space="preserve"> inserita dal supervisore per informare il limite ultimo per il completamento del task</w:t>
+      </w:r>
+    </w:p>
+    <w:p>
+      <w:pPr>
+        <w:pStyle w:val="Paragrafoelenco"/>
+        <w:numPr>
+          <w:ilvl w:val="0"/>
+          <w:numId w:val="10"/>
+        </w:numPr>
+      </w:pPr>
+      <w:r>
+        <w:rPr>
+          <w:b/>
+          <w:bCs/>
+        </w:rPr>
+        <w:t>Priorità</w:t>
+      </w:r>
+      <w:r>
+        <w:t>:</w:t>
+      </w:r>
+      <w:r>
+        <w:t xml:space="preserve"> permette al supervisore di specificare la priorità del task, utilizzata dal sistema per implementare dei filtri.</w:t>
+      </w:r>
+    </w:p>
+    <w:p>
+      <w:pPr>
+        <w:pStyle w:val="Paragrafoelenco"/>
+        <w:numPr>
+          <w:ilvl w:val="0"/>
+          <w:numId w:val="10"/>
+        </w:numPr>
+      </w:pPr>
+      <w:r>
+        <w:rPr>
+          <w:b/>
+          <w:bCs/>
+        </w:rPr>
+        <w:t>Istruzioni</w:t>
+      </w:r>
+      <w:r>
+        <w:t>:</w:t>
+      </w:r>
+      <w:r>
+        <w:t xml:space="preserve"> area dove è possibile inserire le istruzioni necessarie per il completamento del task</w:t>
+      </w:r>
+    </w:p>
+    <w:p>
+      <w:pPr>
+        <w:pStyle w:val="Paragrafoelenco"/>
+        <w:numPr>
+          <w:ilvl w:val="0"/>
+          <w:numId w:val="10"/>
+        </w:numPr>
+      </w:pPr>
+      <w:r>
+        <w:rPr>
+          <w:b/>
+          <w:bCs/>
+        </w:rPr>
+        <w:t>Stato</w:t>
+      </w:r>
+      <w:r>
+        <w:t>:</w:t>
+      </w:r>
+      <w:r>
+        <w:t xml:space="preserve"> stato del task, all’interno del sistema sono presenti </w:t>
+      </w:r>
+      <w:proofErr w:type="gramStart"/>
+      <w:r>
+        <w:t>4</w:t>
+      </w:r>
+      <w:proofErr w:type="gramEnd"/>
+      <w:r>
+        <w:t xml:space="preserve"> stati differenti </w:t>
+      </w:r>
+      <w:r>
+        <w:sym w:font="Wingdings" w:char="F0E0"/>
+      </w:r>
+    </w:p>
+    <w:p>
+      <w:pPr>
+        <w:pStyle w:val="Paragrafoelenco"/>
+        <w:numPr>
+          <w:ilvl w:val="1"/>
+          <w:numId w:val="10"/>
+        </w:numPr>
+      </w:pPr>
+      <w:r>
+        <w:rPr>
+          <w:b/>
+          <w:bCs/>
+        </w:rPr>
+        <w:t>Da completare</w:t>
+      </w:r>
+      <w:r>
+        <w:t>:</w:t>
+      </w:r>
+      <w:r>
+        <w:rPr>
+          <w:b/>
+          <w:bCs/>
+        </w:rPr>
+        <w:t xml:space="preserve"> </w:t>
+      </w:r>
+      <w:r>
+        <w:t>il</w:t>
+      </w:r>
+      <w:r>
+        <w:rPr>
+          <w:b/>
+          <w:bCs/>
+        </w:rPr>
+        <w:t xml:space="preserve"> </w:t>
+      </w:r>
+      <w:r>
+        <w:t>task</w:t>
+      </w:r>
+      <w:r>
+        <w:rPr>
+          <w:b/>
+          <w:bCs/>
+        </w:rPr>
+        <w:t xml:space="preserve"> </w:t>
+      </w:r>
+      <w:r>
+        <w:t>è stato creato e il dipendente non lo ha ancora inizializzato</w:t>
+      </w:r>
+    </w:p>
+    <w:p>
+      <w:pPr>
+        <w:pStyle w:val="Paragrafoelenco"/>
+        <w:numPr>
+          <w:ilvl w:val="1"/>
+          <w:numId w:val="10"/>
+        </w:numPr>
+        <w:rPr>
+          <w:b/>
+          <w:bCs/>
+        </w:rPr>
+      </w:pPr>
+      <w:r>
+        <w:rPr>
+          <w:b/>
+          <w:bCs/>
+        </w:rPr>
+        <w:t xml:space="preserve">In </w:t>
+      </w:r>
+      <w:r>
+        <w:rPr>
+          <w:b/>
+          <w:bCs/>
+        </w:rPr>
+        <w:t>esecuzione</w:t>
+      </w:r>
+      <w:r>
+        <w:t>: il task è stato inizializzato dal dipendente (possibile se il task non è ancora scaduto)</w:t>
+      </w:r>
+    </w:p>
+    <w:p>
+      <w:pPr>
+        <w:pStyle w:val="Paragrafoelenco"/>
+        <w:numPr>
+          <w:ilvl w:val="1"/>
+          <w:numId w:val="10"/>
+        </w:numPr>
+        <w:rPr>
+          <w:b/>
+          <w:bCs/>
+        </w:rPr>
+      </w:pPr>
+      <w:r>
+        <w:rPr>
+          <w:b/>
+          <w:bCs/>
+        </w:rPr>
+        <w:t>Sospeso</w:t>
+      </w:r>
+      <w:r>
+        <w:t>:</w:t>
+      </w:r>
+      <w:r>
+        <w:t xml:space="preserve"> Il task è stato sospeso o dal dipendente o dal supervisore stesso</w:t>
+      </w:r>
+    </w:p>
+    <w:p>
+      <w:pPr>
+        <w:pStyle w:val="Paragrafoelenco"/>
+        <w:numPr>
+          <w:ilvl w:val="1"/>
+          <w:numId w:val="10"/>
+        </w:numPr>
+        <w:rPr>
+          <w:b/>
+          <w:bCs/>
+        </w:rPr>
+      </w:pPr>
+      <w:r>
+        <w:rPr>
+          <w:b/>
+          <w:bCs/>
+        </w:rPr>
+        <w:t xml:space="preserve">Completato: </w:t>
+      </w:r>
+      <w:r>
+        <w:t>il task è stato completato dal dipendente</w:t>
+      </w:r>
+    </w:p>
+    <w:p>
+      <w:pPr>
+        <w:rPr>
+          <w:b/>
+          <w:bCs/>
+        </w:rPr>
+      </w:pPr>
+    </w:p>
+    <w:p>
+      <w:r>
+        <w:t xml:space="preserve">La tabella Task ha poi una relazione </w:t>
+      </w:r>
+      <w:proofErr w:type="spellStart"/>
+      <w:r>
+        <w:t>one-to-one</w:t>
+      </w:r>
+      <w:proofErr w:type="spellEnd"/>
+      <w:r>
+        <w:t xml:space="preserve"> con la tabella Allegato, è possibile per il supervisore, infatti, caricare un allegato insieme al task. Dato che passare dallo stato “in esecuzione” a “Sospeso” o l’eliminazione del task dal ha bisogno di inserire una motivazione, questa motivazione viene poi </w:t>
+      </w:r>
+      <w:r>
+        <w:t>consegnata al destinatario tramite notifica e per questo è presente una relazione one-to-</w:t>
+      </w:r>
+      <w:proofErr w:type="spellStart"/>
+      <w:r>
+        <w:t>many</w:t>
+      </w:r>
+      <w:proofErr w:type="spellEnd"/>
+      <w:r>
+        <w:t xml:space="preserve"> con la tabella “Notifica”.</w:t>
+      </w:r>
+    </w:p>
+    <w:p>
+      <w:r>
+        <w:t>La  tabella avrà anche le chiavi esterne che la legano alla tabella utente:</w:t>
+      </w:r>
+    </w:p>
+    <w:p>
+      <w:pPr>
+        <w:pStyle w:val="Paragrafoelenco"/>
+        <w:numPr>
+          <w:ilvl w:val="0"/>
+          <w:numId w:val="10"/>
+        </w:numPr>
+      </w:pPr>
+      <w:r>
+        <w:t>Supervisore</w:t>
+      </w:r>
+    </w:p>
+    <w:p>
+      <w:pPr>
+        <w:pStyle w:val="Paragrafoelenco"/>
+        <w:numPr>
+          <w:ilvl w:val="0"/>
+          <w:numId w:val="10"/>
+        </w:numPr>
+      </w:pPr>
+      <w:r>
+        <w:t>Dipendente</w:t>
+      </w:r>
+    </w:p>
+    <w:p>
+      <w:r>
+        <w:t>La presenza di queste chiavi esterne permette un facile recupero dei task quando il sistema avrà bisogno di caricarli per mostrarli al dipendente o al supervisore.</w:t>
+      </w:r>
+    </w:p>
+    <w:p/>
+    <w:p/>
+    <w:p/>
+    <w:p>
+      <w:pPr>
+        <w:pStyle w:val="Titolo3"/>
+        <w:numPr>
+          <w:ilvl w:val="2"/>
+          <w:numId w:val="8"/>
+        </w:numPr>
+        <w:ind w:left="709"/>
+      </w:pPr>
+      <w:r>
+        <w:t>Allegato</w:t>
+      </w:r>
+    </w:p>
+    <w:p/>
+    <w:p>
+      <w:r>
+        <w:t>Allegato è la tabella per conservare gli allegati ai tasks. Allegato non contiene l’allegato in sé, ma contiene le informazioni principali per recuperare l’allegato salvato all’interno del server.</w:t>
+      </w:r>
+    </w:p>
+    <w:p>
+      <w:r>
+        <w:t xml:space="preserve">Contiene: </w:t>
+      </w:r>
+    </w:p>
+    <w:p>
+      <w:pPr>
+        <w:pStyle w:val="Paragrafoelenco"/>
+        <w:numPr>
+          <w:ilvl w:val="0"/>
+          <w:numId w:val="10"/>
+        </w:numPr>
+      </w:pPr>
+      <w:proofErr w:type="spellStart"/>
+      <w:r>
+        <w:rPr>
+          <w:b/>
+          <w:bCs/>
+        </w:rPr>
+        <w:t>Filename</w:t>
+      </w:r>
+      <w:proofErr w:type="spellEnd"/>
+      <w:r>
+        <w:rPr>
+          <w:b/>
+          <w:bCs/>
+        </w:rPr>
+        <w:t xml:space="preserve">: </w:t>
+      </w:r>
+      <w:r>
+        <w:t xml:space="preserve">è la chiave principale della tabella, ed è uguale al </w:t>
+      </w:r>
+      <w:proofErr w:type="spellStart"/>
+      <w:r>
+        <w:t>filename</w:t>
+      </w:r>
+      <w:proofErr w:type="spellEnd"/>
+      <w:r>
+        <w:t xml:space="preserve"> dell’allegato, sarà il sistema a garantire l’unicità della chiave.</w:t>
+      </w:r>
+    </w:p>
+    <w:p>
+      <w:pPr>
+        <w:pStyle w:val="Paragrafoelenco"/>
+        <w:numPr>
+          <w:ilvl w:val="0"/>
+          <w:numId w:val="10"/>
+        </w:numPr>
+      </w:pPr>
+      <w:proofErr w:type="spellStart"/>
+      <w:r>
+        <w:rPr>
+          <w:b/>
+          <w:bCs/>
+        </w:rPr>
+        <w:t>Task_id</w:t>
+      </w:r>
+      <w:proofErr w:type="spellEnd"/>
+      <w:r>
+        <w:rPr>
+          <w:b/>
+          <w:bCs/>
+        </w:rPr>
+        <w:t>:</w:t>
+      </w:r>
+      <w:r>
+        <w:t xml:space="preserve"> chiave </w:t>
+      </w:r>
+      <w:r>
+        <w:t>esterna che lega l’allegato al task</w:t>
+      </w:r>
+    </w:p>
+    <w:p>
+      <w:pPr>
+        <w:pStyle w:val="Paragrafoelenco"/>
+        <w:numPr>
+          <w:ilvl w:val="0"/>
+          <w:numId w:val="10"/>
+        </w:numPr>
+      </w:pPr>
+      <w:proofErr w:type="spellStart"/>
+      <w:r>
+        <w:rPr>
+          <w:b/>
+          <w:bCs/>
+        </w:rPr>
+        <w:t>Filepath</w:t>
+      </w:r>
+      <w:proofErr w:type="spellEnd"/>
+      <w:r>
+        <w:rPr>
+          <w:b/>
+          <w:bCs/>
+        </w:rPr>
+        <w:t>:</w:t>
+      </w:r>
+      <w:r>
+        <w:t xml:space="preserve"> il </w:t>
+      </w:r>
+      <w:proofErr w:type="spellStart"/>
+      <w:r>
+        <w:t>path</w:t>
+      </w:r>
+      <w:proofErr w:type="spellEnd"/>
+      <w:r>
+        <w:t xml:space="preserve"> dove è stato salvato l’allegato</w:t>
+      </w:r>
+    </w:p>
+    <w:p>
+      <w:pPr>
+        <w:pStyle w:val="Paragrafoelenco"/>
+        <w:numPr>
+          <w:ilvl w:val="0"/>
+          <w:numId w:val="10"/>
+        </w:numPr>
+      </w:pPr>
+      <w:proofErr w:type="spellStart"/>
+      <w:r>
+        <w:rPr>
+          <w:b/>
+          <w:bCs/>
+        </w:rPr>
+        <w:lastRenderedPageBreak/>
+        <w:t>Content_type</w:t>
+      </w:r>
+      <w:proofErr w:type="spellEnd"/>
+      <w:r>
+        <w:rPr>
+          <w:b/>
+          <w:bCs/>
+        </w:rPr>
+        <w:t>:</w:t>
+      </w:r>
+      <w:r>
+        <w:t xml:space="preserve"> specifica tramite notazione MIME il tipo dell’allegato</w:t>
+      </w:r>
+    </w:p>
+    <w:p/>
+    <w:p/>
+    <w:p/>
+    <w:p/>
+    <w:p/>
     <w:sectPr>
       <w:footnotePr>
         <w:pos w:val="beneathText"/>
@@ -2537,12 +3295,14 @@
             </w:rPr>
             <w:t xml:space="preserve">Documento: </w:t>
           </w:r>
+          <w:proofErr w:type="spellStart"/>
           <w:r>
             <w:rPr>
               <w:sz w:val="20"/>
             </w:rPr>
             <w:t>DataBaseInformation</w:t>
           </w:r>
+          <w:proofErr w:type="spellEnd"/>
         </w:p>
       </w:tc>
       <w:tc>
@@ -3226,9 +3986,9 @@
   </w:abstractNum>
   <w:abstractNum w:abstractNumId="5" w15:restartNumberingAfterBreak="0">
     <w:nsid w:val="5DC22D5F"/>
-    <w:multiLevelType w:val="hybridMultilevel"/>
-    <w:tmpl w:val="9D52EFDE"/>
-    <w:lvl w:ilvl="0" w:tplc="0410000F">
+    <w:multiLevelType w:val="multilevel"/>
+    <w:tmpl w:val="516E50F6"/>
+    <w:lvl w:ilvl="0">
       <w:start w:val="1"/>
       <w:numFmt w:val="decimal"/>
       <w:lvlText w:val="%1."/>
@@ -3240,77 +4000,109 @@
         <w:rFonts w:hint="default"/>
       </w:rPr>
     </w:lvl>
-    <w:lvl w:ilvl="1" w:tplc="04100019" w:tentative="1">
-      <w:start w:val="1"/>
-      <w:numFmt w:val="lowerLetter"/>
-      <w:lvlText w:val="%2."/>
-      <w:lvlJc w:val="left"/>
-      <w:pPr>
-        <w:ind w:left="1440" w:hanging="360"/>
-      </w:pPr>
-    </w:lvl>
-    <w:lvl w:ilvl="2" w:tplc="0410001B" w:tentative="1">
-      <w:start w:val="1"/>
-      <w:numFmt w:val="lowerRoman"/>
-      <w:lvlText w:val="%3."/>
-      <w:lvlJc w:val="right"/>
-      <w:pPr>
-        <w:ind w:left="2160" w:hanging="180"/>
-      </w:pPr>
-    </w:lvl>
-    <w:lvl w:ilvl="3" w:tplc="0410000F" w:tentative="1">
+    <w:lvl w:ilvl="1">
       <w:start w:val="1"/>
       <w:numFmt w:val="decimal"/>
-      <w:lvlText w:val="%4."/>
-      <w:lvlJc w:val="left"/>
-      <w:pPr>
-        <w:ind w:left="2880" w:hanging="360"/>
-      </w:pPr>
-    </w:lvl>
-    <w:lvl w:ilvl="4" w:tplc="04100019" w:tentative="1">
-      <w:start w:val="1"/>
-      <w:numFmt w:val="lowerLetter"/>
-      <w:lvlText w:val="%5."/>
-      <w:lvlJc w:val="left"/>
-      <w:pPr>
-        <w:ind w:left="3600" w:hanging="360"/>
-      </w:pPr>
-    </w:lvl>
-    <w:lvl w:ilvl="5" w:tplc="0410001B" w:tentative="1">
-      <w:start w:val="1"/>
-      <w:numFmt w:val="lowerRoman"/>
-      <w:lvlText w:val="%6."/>
-      <w:lvlJc w:val="right"/>
-      <w:pPr>
-        <w:ind w:left="4320" w:hanging="180"/>
-      </w:pPr>
-    </w:lvl>
-    <w:lvl w:ilvl="6" w:tplc="0410000F" w:tentative="1">
-      <w:start w:val="1"/>
+      <w:isLgl/>
+      <w:lvlText w:val="%1.%2"/>
+      <w:lvlJc w:val="left"/>
+      <w:pPr>
+        <w:ind w:left="984" w:hanging="624"/>
+      </w:pPr>
+      <w:rPr>
+        <w:rFonts w:hint="default"/>
+      </w:rPr>
+    </w:lvl>
+    <w:lvl w:ilvl="2">
+      <w:start w:val="2"/>
       <w:numFmt w:val="decimal"/>
-      <w:lvlText w:val="%7."/>
-      <w:lvlJc w:val="left"/>
-      <w:pPr>
-        <w:ind w:left="5040" w:hanging="360"/>
-      </w:pPr>
-    </w:lvl>
-    <w:lvl w:ilvl="7" w:tplc="04100019" w:tentative="1">
-      <w:start w:val="1"/>
-      <w:numFmt w:val="lowerLetter"/>
-      <w:lvlText w:val="%8."/>
-      <w:lvlJc w:val="left"/>
-      <w:pPr>
-        <w:ind w:left="5760" w:hanging="360"/>
-      </w:pPr>
-    </w:lvl>
-    <w:lvl w:ilvl="8" w:tplc="0410001B" w:tentative="1">
-      <w:start w:val="1"/>
-      <w:numFmt w:val="lowerRoman"/>
-      <w:lvlText w:val="%9."/>
-      <w:lvlJc w:val="right"/>
-      <w:pPr>
-        <w:ind w:left="6480" w:hanging="180"/>
-      </w:pPr>
+      <w:isLgl/>
+      <w:lvlText w:val="%1.%2.%3"/>
+      <w:lvlJc w:val="left"/>
+      <w:pPr>
+        <w:ind w:left="1430" w:hanging="720"/>
+      </w:pPr>
+      <w:rPr>
+        <w:rFonts w:hint="default"/>
+      </w:rPr>
+    </w:lvl>
+    <w:lvl w:ilvl="3">
+      <w:start w:val="1"/>
+      <w:numFmt w:val="decimal"/>
+      <w:isLgl/>
+      <w:lvlText w:val="%1.%2.%3.%4"/>
+      <w:lvlJc w:val="left"/>
+      <w:pPr>
+        <w:ind w:left="1080" w:hanging="720"/>
+      </w:pPr>
+      <w:rPr>
+        <w:rFonts w:hint="default"/>
+      </w:rPr>
+    </w:lvl>
+    <w:lvl w:ilvl="4">
+      <w:start w:val="1"/>
+      <w:numFmt w:val="decimal"/>
+      <w:isLgl/>
+      <w:lvlText w:val="%1.%2.%3.%4.%5"/>
+      <w:lvlJc w:val="left"/>
+      <w:pPr>
+        <w:ind w:left="1440" w:hanging="1080"/>
+      </w:pPr>
+      <w:rPr>
+        <w:rFonts w:hint="default"/>
+      </w:rPr>
+    </w:lvl>
+    <w:lvl w:ilvl="5">
+      <w:start w:val="1"/>
+      <w:numFmt w:val="decimal"/>
+      <w:isLgl/>
+      <w:lvlText w:val="%1.%2.%3.%4.%5.%6"/>
+      <w:lvlJc w:val="left"/>
+      <w:pPr>
+        <w:ind w:left="1440" w:hanging="1080"/>
+      </w:pPr>
+      <w:rPr>
+        <w:rFonts w:hint="default"/>
+      </w:rPr>
+    </w:lvl>
+    <w:lvl w:ilvl="6">
+      <w:start w:val="1"/>
+      <w:numFmt w:val="decimal"/>
+      <w:isLgl/>
+      <w:lvlText w:val="%1.%2.%3.%4.%5.%6.%7"/>
+      <w:lvlJc w:val="left"/>
+      <w:pPr>
+        <w:ind w:left="1800" w:hanging="1440"/>
+      </w:pPr>
+      <w:rPr>
+        <w:rFonts w:hint="default"/>
+      </w:rPr>
+    </w:lvl>
+    <w:lvl w:ilvl="7">
+      <w:start w:val="1"/>
+      <w:numFmt w:val="decimal"/>
+      <w:isLgl/>
+      <w:lvlText w:val="%1.%2.%3.%4.%5.%6.%7.%8"/>
+      <w:lvlJc w:val="left"/>
+      <w:pPr>
+        <w:ind w:left="1800" w:hanging="1440"/>
+      </w:pPr>
+      <w:rPr>
+        <w:rFonts w:hint="default"/>
+      </w:rPr>
+    </w:lvl>
+    <w:lvl w:ilvl="8">
+      <w:start w:val="1"/>
+      <w:numFmt w:val="decimal"/>
+      <w:isLgl/>
+      <w:lvlText w:val="%1.%2.%3.%4.%5.%6.%7.%8.%9"/>
+      <w:lvlJc w:val="left"/>
+      <w:pPr>
+        <w:ind w:left="2160" w:hanging="1800"/>
+      </w:pPr>
+      <w:rPr>
+        <w:rFonts w:hint="default"/>
+      </w:rPr>
     </w:lvl>
   </w:abstractNum>
   <w:abstractNum w:abstractNumId="6" w15:restartNumberingAfterBreak="0">
@@ -3329,7 +4121,7 @@
         <w:rFonts w:ascii="Times New Roman" w:eastAsiaTheme="minorHAnsi" w:hAnsi="Times New Roman" w:cs="Times New Roman" w:hint="default"/>
       </w:rPr>
     </w:lvl>
-    <w:lvl w:ilvl="1" w:tplc="04100003" w:tentative="1">
+    <w:lvl w:ilvl="1" w:tplc="04100003">
       <w:start w:val="1"/>
       <w:numFmt w:val="bullet"/>
       <w:lvlText w:val="o"/>

</xml_diff>

<commit_message>
Mod: modificati Le interfacce del persistanceManagement
</commit_message>
<xml_diff>
--- a/Workspace/SDD/DBI_EWMS.docx
+++ b/Workspace/SDD/DBI_EWMS.docx
@@ -1878,16 +1878,554 @@
       </w:pPr>
     </w:p>
     <w:p>
-      <w:fldSimple w:instr=" TOC \o &quot;1-3&quot; \h \z \u ">
+      <w:pPr>
+        <w:pStyle w:val="Sommario1"/>
+        <w:tabs>
+          <w:tab w:val="left" w:pos="480"/>
+        </w:tabs>
+        <w:rPr>
+          <w:rFonts w:asciiTheme="minorHAnsi" w:eastAsiaTheme="minorEastAsia" w:hAnsiTheme="minorHAnsi" w:cstheme="minorBidi"/>
+          <w:noProof/>
+          <w:kern w:val="2"/>
+          <w:lang w:eastAsia="it-IT"/>
+          <w14:ligatures w14:val="standardContextual"/>
+        </w:rPr>
+      </w:pPr>
+      <w:r>
+        <w:fldChar w:fldCharType="begin"/>
+      </w:r>
+      <w:r>
+        <w:instrText xml:space="preserve"> TOC \o "1-3" \h \z \u </w:instrText>
+      </w:r>
+      <w:r>
+        <w:fldChar w:fldCharType="separate"/>
+      </w:r>
+      <w:hyperlink w:anchor="_Toc220753520" w:history="1">
         <w:r>
           <w:rPr>
-            <w:b/>
-            <w:bCs/>
+            <w:rStyle w:val="Collegamentoipertestuale"/>
             <w:noProof/>
           </w:rPr>
-          <w:t>Nessuna voce di sommario trovata.</w:t>
+          <w:t>1.</w:t>
         </w:r>
-      </w:fldSimple>
+        <w:r>
+          <w:rPr>
+            <w:rFonts w:asciiTheme="minorHAnsi" w:eastAsiaTheme="minorEastAsia" w:hAnsiTheme="minorHAnsi" w:cstheme="minorBidi"/>
+            <w:noProof/>
+            <w:kern w:val="2"/>
+            <w:lang w:eastAsia="it-IT"/>
+            <w14:ligatures w14:val="standardContextual"/>
+          </w:rPr>
+          <w:tab/>
+        </w:r>
+        <w:r>
+          <w:rPr>
+            <w:rStyle w:val="Collegamentoipertestuale"/>
+            <w:noProof/>
+          </w:rPr>
+          <w:t>Introduzione</w:t>
+        </w:r>
+        <w:r>
+          <w:rPr>
+            <w:noProof/>
+            <w:webHidden/>
+          </w:rPr>
+          <w:tab/>
+        </w:r>
+        <w:r>
+          <w:rPr>
+            <w:noProof/>
+            <w:webHidden/>
+          </w:rPr>
+          <w:fldChar w:fldCharType="begin"/>
+        </w:r>
+        <w:r>
+          <w:rPr>
+            <w:noProof/>
+            <w:webHidden/>
+          </w:rPr>
+          <w:instrText xml:space="preserve"> PAGEREF _Toc220753520 \h </w:instrText>
+        </w:r>
+        <w:r>
+          <w:rPr>
+            <w:noProof/>
+            <w:webHidden/>
+          </w:rPr>
+        </w:r>
+        <w:r>
+          <w:rPr>
+            <w:noProof/>
+            <w:webHidden/>
+          </w:rPr>
+          <w:fldChar w:fldCharType="separate"/>
+        </w:r>
+        <w:r>
+          <w:rPr>
+            <w:noProof/>
+            <w:webHidden/>
+          </w:rPr>
+          <w:t>4</w:t>
+        </w:r>
+        <w:r>
+          <w:rPr>
+            <w:noProof/>
+            <w:webHidden/>
+          </w:rPr>
+          <w:fldChar w:fldCharType="end"/>
+        </w:r>
+      </w:hyperlink>
+    </w:p>
+    <w:p>
+      <w:pPr>
+        <w:pStyle w:val="Sommario1"/>
+        <w:tabs>
+          <w:tab w:val="left" w:pos="480"/>
+        </w:tabs>
+        <w:rPr>
+          <w:rFonts w:asciiTheme="minorHAnsi" w:eastAsiaTheme="minorEastAsia" w:hAnsiTheme="minorHAnsi" w:cstheme="minorBidi"/>
+          <w:noProof/>
+          <w:kern w:val="2"/>
+          <w:lang w:eastAsia="it-IT"/>
+          <w14:ligatures w14:val="standardContextual"/>
+        </w:rPr>
+      </w:pPr>
+      <w:hyperlink w:anchor="_Toc220753521" w:history="1">
+        <w:r>
+          <w:rPr>
+            <w:rStyle w:val="Collegamentoipertestuale"/>
+            <w:noProof/>
+          </w:rPr>
+          <w:t>2.</w:t>
+        </w:r>
+        <w:r>
+          <w:rPr>
+            <w:rFonts w:asciiTheme="minorHAnsi" w:eastAsiaTheme="minorEastAsia" w:hAnsiTheme="minorHAnsi" w:cstheme="minorBidi"/>
+            <w:noProof/>
+            <w:kern w:val="2"/>
+            <w:lang w:eastAsia="it-IT"/>
+            <w14:ligatures w14:val="standardContextual"/>
+          </w:rPr>
+          <w:tab/>
+        </w:r>
+        <w:r>
+          <w:rPr>
+            <w:rStyle w:val="Collegamentoipertestuale"/>
+            <w:noProof/>
+          </w:rPr>
+          <w:t>Descrizione Database</w:t>
+        </w:r>
+        <w:r>
+          <w:rPr>
+            <w:noProof/>
+            <w:webHidden/>
+          </w:rPr>
+          <w:tab/>
+        </w:r>
+        <w:r>
+          <w:rPr>
+            <w:noProof/>
+            <w:webHidden/>
+          </w:rPr>
+          <w:fldChar w:fldCharType="begin"/>
+        </w:r>
+        <w:r>
+          <w:rPr>
+            <w:noProof/>
+            <w:webHidden/>
+          </w:rPr>
+          <w:instrText xml:space="preserve"> PAGEREF _Toc220753521 \h </w:instrText>
+        </w:r>
+        <w:r>
+          <w:rPr>
+            <w:noProof/>
+            <w:webHidden/>
+          </w:rPr>
+        </w:r>
+        <w:r>
+          <w:rPr>
+            <w:noProof/>
+            <w:webHidden/>
+          </w:rPr>
+          <w:fldChar w:fldCharType="separate"/>
+        </w:r>
+        <w:r>
+          <w:rPr>
+            <w:noProof/>
+            <w:webHidden/>
+          </w:rPr>
+          <w:t>4</w:t>
+        </w:r>
+        <w:r>
+          <w:rPr>
+            <w:noProof/>
+            <w:webHidden/>
+          </w:rPr>
+          <w:fldChar w:fldCharType="end"/>
+        </w:r>
+      </w:hyperlink>
+    </w:p>
+    <w:p>
+      <w:pPr>
+        <w:pStyle w:val="Sommario2"/>
+        <w:tabs>
+          <w:tab w:val="left" w:pos="1132"/>
+        </w:tabs>
+        <w:rPr>
+          <w:rFonts w:asciiTheme="minorHAnsi" w:eastAsiaTheme="minorEastAsia" w:hAnsiTheme="minorHAnsi" w:cstheme="minorBidi"/>
+          <w:noProof/>
+          <w:kern w:val="2"/>
+          <w:lang w:eastAsia="it-IT"/>
+          <w14:ligatures w14:val="standardContextual"/>
+        </w:rPr>
+      </w:pPr>
+      <w:hyperlink w:anchor="_Toc220753522" w:history="1">
+        <w:r>
+          <w:rPr>
+            <w:rStyle w:val="Collegamentoipertestuale"/>
+            <w:noProof/>
+          </w:rPr>
+          <w:t>2.1</w:t>
+        </w:r>
+        <w:r>
+          <w:rPr>
+            <w:rFonts w:asciiTheme="minorHAnsi" w:eastAsiaTheme="minorEastAsia" w:hAnsiTheme="minorHAnsi" w:cstheme="minorBidi"/>
+            <w:noProof/>
+            <w:kern w:val="2"/>
+            <w:lang w:eastAsia="it-IT"/>
+            <w14:ligatures w14:val="standardContextual"/>
+          </w:rPr>
+          <w:tab/>
+        </w:r>
+        <w:r>
+          <w:rPr>
+            <w:rStyle w:val="Collegamentoipertestuale"/>
+            <w:noProof/>
+          </w:rPr>
+          <w:t>Descrizione tabelle</w:t>
+        </w:r>
+        <w:r>
+          <w:rPr>
+            <w:noProof/>
+            <w:webHidden/>
+          </w:rPr>
+          <w:tab/>
+        </w:r>
+        <w:r>
+          <w:rPr>
+            <w:noProof/>
+            <w:webHidden/>
+          </w:rPr>
+          <w:fldChar w:fldCharType="begin"/>
+        </w:r>
+        <w:r>
+          <w:rPr>
+            <w:noProof/>
+            <w:webHidden/>
+          </w:rPr>
+          <w:instrText xml:space="preserve"> PAGEREF _Toc220753522 \h </w:instrText>
+        </w:r>
+        <w:r>
+          <w:rPr>
+            <w:noProof/>
+            <w:webHidden/>
+          </w:rPr>
+        </w:r>
+        <w:r>
+          <w:rPr>
+            <w:noProof/>
+            <w:webHidden/>
+          </w:rPr>
+          <w:fldChar w:fldCharType="separate"/>
+        </w:r>
+        <w:r>
+          <w:rPr>
+            <w:noProof/>
+            <w:webHidden/>
+          </w:rPr>
+          <w:t>5</w:t>
+        </w:r>
+        <w:r>
+          <w:rPr>
+            <w:noProof/>
+            <w:webHidden/>
+          </w:rPr>
+          <w:fldChar w:fldCharType="end"/>
+        </w:r>
+      </w:hyperlink>
+    </w:p>
+    <w:p>
+      <w:pPr>
+        <w:pStyle w:val="Sommario3"/>
+        <w:tabs>
+          <w:tab w:val="left" w:pos="1440"/>
+          <w:tab w:val="right" w:leader="dot" w:pos="9627"/>
+        </w:tabs>
+        <w:rPr>
+          <w:rFonts w:asciiTheme="minorHAnsi" w:eastAsiaTheme="minorEastAsia" w:hAnsiTheme="minorHAnsi"/>
+          <w:noProof/>
+          <w:szCs w:val="24"/>
+          <w:lang w:eastAsia="it-IT"/>
+        </w:rPr>
+      </w:pPr>
+      <w:hyperlink w:anchor="_Toc220753523" w:history="1">
+        <w:r>
+          <w:rPr>
+            <w:rStyle w:val="Collegamentoipertestuale"/>
+            <w:noProof/>
+          </w:rPr>
+          <w:t>2.1.1</w:t>
+        </w:r>
+        <w:r>
+          <w:rPr>
+            <w:rFonts w:asciiTheme="minorHAnsi" w:eastAsiaTheme="minorEastAsia" w:hAnsiTheme="minorHAnsi"/>
+            <w:noProof/>
+            <w:szCs w:val="24"/>
+            <w:lang w:eastAsia="it-IT"/>
+          </w:rPr>
+          <w:tab/>
+        </w:r>
+        <w:r>
+          <w:rPr>
+            <w:rStyle w:val="Collegamentoipertestuale"/>
+            <w:noProof/>
+          </w:rPr>
+          <w:t>Utente</w:t>
+        </w:r>
+        <w:r>
+          <w:rPr>
+            <w:noProof/>
+            <w:webHidden/>
+          </w:rPr>
+          <w:tab/>
+        </w:r>
+        <w:r>
+          <w:rPr>
+            <w:noProof/>
+            <w:webHidden/>
+          </w:rPr>
+          <w:fldChar w:fldCharType="begin"/>
+        </w:r>
+        <w:r>
+          <w:rPr>
+            <w:noProof/>
+            <w:webHidden/>
+          </w:rPr>
+          <w:instrText xml:space="preserve"> PAGEREF _Toc220753523 \h </w:instrText>
+        </w:r>
+        <w:r>
+          <w:rPr>
+            <w:noProof/>
+            <w:webHidden/>
+          </w:rPr>
+        </w:r>
+        <w:r>
+          <w:rPr>
+            <w:noProof/>
+            <w:webHidden/>
+          </w:rPr>
+          <w:fldChar w:fldCharType="separate"/>
+        </w:r>
+        <w:r>
+          <w:rPr>
+            <w:noProof/>
+            <w:webHidden/>
+          </w:rPr>
+          <w:t>5</w:t>
+        </w:r>
+        <w:r>
+          <w:rPr>
+            <w:noProof/>
+            <w:webHidden/>
+          </w:rPr>
+          <w:fldChar w:fldCharType="end"/>
+        </w:r>
+      </w:hyperlink>
+    </w:p>
+    <w:p>
+      <w:pPr>
+        <w:pStyle w:val="Sommario3"/>
+        <w:tabs>
+          <w:tab w:val="left" w:pos="1440"/>
+          <w:tab w:val="right" w:leader="dot" w:pos="9627"/>
+        </w:tabs>
+        <w:rPr>
+          <w:rFonts w:asciiTheme="minorHAnsi" w:eastAsiaTheme="minorEastAsia" w:hAnsiTheme="minorHAnsi"/>
+          <w:noProof/>
+          <w:szCs w:val="24"/>
+          <w:lang w:eastAsia="it-IT"/>
+        </w:rPr>
+      </w:pPr>
+      <w:hyperlink w:anchor="_Toc220753524" w:history="1">
+        <w:r>
+          <w:rPr>
+            <w:rStyle w:val="Collegamentoipertestuale"/>
+            <w:noProof/>
+          </w:rPr>
+          <w:t>2.1.2</w:t>
+        </w:r>
+        <w:r>
+          <w:rPr>
+            <w:rFonts w:asciiTheme="minorHAnsi" w:eastAsiaTheme="minorEastAsia" w:hAnsiTheme="minorHAnsi"/>
+            <w:noProof/>
+            <w:szCs w:val="24"/>
+            <w:lang w:eastAsia="it-IT"/>
+          </w:rPr>
+          <w:tab/>
+        </w:r>
+        <w:r>
+          <w:rPr>
+            <w:rStyle w:val="Collegamentoipertestuale"/>
+            <w:noProof/>
+          </w:rPr>
+          <w:t>Task</w:t>
+        </w:r>
+        <w:r>
+          <w:rPr>
+            <w:noProof/>
+            <w:webHidden/>
+          </w:rPr>
+          <w:tab/>
+        </w:r>
+        <w:r>
+          <w:rPr>
+            <w:noProof/>
+            <w:webHidden/>
+          </w:rPr>
+          <w:fldChar w:fldCharType="begin"/>
+        </w:r>
+        <w:r>
+          <w:rPr>
+            <w:noProof/>
+            <w:webHidden/>
+          </w:rPr>
+          <w:instrText xml:space="preserve"> PAGEREF _Toc220753524 \h </w:instrText>
+        </w:r>
+        <w:r>
+          <w:rPr>
+            <w:noProof/>
+            <w:webHidden/>
+          </w:rPr>
+        </w:r>
+        <w:r>
+          <w:rPr>
+            <w:noProof/>
+            <w:webHidden/>
+          </w:rPr>
+          <w:fldChar w:fldCharType="separate"/>
+        </w:r>
+        <w:r>
+          <w:rPr>
+            <w:noProof/>
+            <w:webHidden/>
+          </w:rPr>
+          <w:t>5</w:t>
+        </w:r>
+        <w:r>
+          <w:rPr>
+            <w:noProof/>
+            <w:webHidden/>
+          </w:rPr>
+          <w:fldChar w:fldCharType="end"/>
+        </w:r>
+      </w:hyperlink>
+    </w:p>
+    <w:p>
+      <w:pPr>
+        <w:pStyle w:val="Sommario3"/>
+        <w:tabs>
+          <w:tab w:val="left" w:pos="1440"/>
+          <w:tab w:val="right" w:leader="dot" w:pos="9627"/>
+        </w:tabs>
+        <w:rPr>
+          <w:rFonts w:asciiTheme="minorHAnsi" w:eastAsiaTheme="minorEastAsia" w:hAnsiTheme="minorHAnsi"/>
+          <w:noProof/>
+          <w:szCs w:val="24"/>
+          <w:lang w:eastAsia="it-IT"/>
+        </w:rPr>
+      </w:pPr>
+      <w:hyperlink w:anchor="_Toc220753525" w:history="1">
+        <w:r>
+          <w:rPr>
+            <w:rStyle w:val="Collegamentoipertestuale"/>
+            <w:noProof/>
+          </w:rPr>
+          <w:t>2.1.3</w:t>
+        </w:r>
+        <w:r>
+          <w:rPr>
+            <w:rFonts w:asciiTheme="minorHAnsi" w:eastAsiaTheme="minorEastAsia" w:hAnsiTheme="minorHAnsi"/>
+            <w:noProof/>
+            <w:szCs w:val="24"/>
+            <w:lang w:eastAsia="it-IT"/>
+          </w:rPr>
+          <w:tab/>
+        </w:r>
+        <w:r>
+          <w:rPr>
+            <w:rStyle w:val="Collegamentoipertestuale"/>
+            <w:noProof/>
+          </w:rPr>
+          <w:t>Allegato</w:t>
+        </w:r>
+        <w:r>
+          <w:rPr>
+            <w:noProof/>
+            <w:webHidden/>
+          </w:rPr>
+          <w:tab/>
+        </w:r>
+        <w:r>
+          <w:rPr>
+            <w:noProof/>
+            <w:webHidden/>
+          </w:rPr>
+          <w:fldChar w:fldCharType="begin"/>
+        </w:r>
+        <w:r>
+          <w:rPr>
+            <w:noProof/>
+            <w:webHidden/>
+          </w:rPr>
+          <w:instrText xml:space="preserve"> PAGEREF _Toc220753525 \h </w:instrText>
+        </w:r>
+        <w:r>
+          <w:rPr>
+            <w:noProof/>
+            <w:webHidden/>
+          </w:rPr>
+        </w:r>
+        <w:r>
+          <w:rPr>
+            <w:noProof/>
+            <w:webHidden/>
+          </w:rPr>
+          <w:fldChar w:fldCharType="separate"/>
+        </w:r>
+        <w:r>
+          <w:rPr>
+            <w:noProof/>
+            <w:webHidden/>
+          </w:rPr>
+          <w:t>6</w:t>
+        </w:r>
+        <w:r>
+          <w:rPr>
+            <w:noProof/>
+            <w:webHidden/>
+          </w:rPr>
+          <w:fldChar w:fldCharType="end"/>
+        </w:r>
+      </w:hyperlink>
+    </w:p>
+    <w:p>
+      <w:r>
+        <w:rPr>
+          <w:b/>
+          <w:bCs/>
+          <w:noProof/>
+        </w:rPr>
+        <w:fldChar w:fldCharType="end"/>
+      </w:r>
     </w:p>
     <w:p>
       <w:pPr>
@@ -1924,10 +2462,12 @@
         </w:numPr>
         <w:ind w:left="142"/>
       </w:pPr>
+      <w:bookmarkStart w:id="0" w:name="_Toc220753520"/>
       <w:r>
         <w:lastRenderedPageBreak/>
         <w:t>Introduzione</w:t>
       </w:r>
+      <w:bookmarkEnd w:id="0"/>
     </w:p>
     <w:p/>
     <w:p>
@@ -2031,9 +2571,11 @@
         </w:numPr>
         <w:ind w:left="142"/>
       </w:pPr>
+      <w:bookmarkStart w:id="1" w:name="_Toc220753521"/>
       <w:r>
         <w:t>Descrizione Database</w:t>
       </w:r>
+      <w:bookmarkEnd w:id="1"/>
     </w:p>
     <w:p/>
     <w:p>
@@ -2042,10 +2584,10 @@
           <w:noProof/>
         </w:rPr>
         <w:drawing>
-          <wp:inline distT="0" distB="0" distL="0" distR="0" wp14:anchorId="2FE3C401" wp14:editId="43C3A48E">
-            <wp:extent cx="6119495" cy="3651250"/>
-            <wp:effectExtent l="0" t="0" r="0" b="6350"/>
-            <wp:docPr id="1359903398" name="Elemento grafico 2"/>
+          <wp:inline distT="0" distB="0" distL="0" distR="0" wp14:anchorId="40F1B6E6" wp14:editId="0C842E8C">
+            <wp:extent cx="6119495" cy="3774440"/>
+            <wp:effectExtent l="0" t="0" r="0" b="0"/>
+            <wp:docPr id="967283734" name="Elemento grafico 1"/>
             <wp:cNvGraphicFramePr>
               <a:graphicFrameLocks xmlns:a="http://schemas.openxmlformats.org/drawingml/2006/main" noChangeAspect="1"/>
             </wp:cNvGraphicFramePr>
@@ -2053,7 +2595,7 @@
               <a:graphicData uri="http://schemas.openxmlformats.org/drawingml/2006/picture">
                 <pic:pic xmlns:pic="http://schemas.openxmlformats.org/drawingml/2006/picture">
                   <pic:nvPicPr>
-                    <pic:cNvPr id="1359903398" name="Elemento grafico 1359903398"/>
+                    <pic:cNvPr id="967283734" name="Elemento grafico 967283734"/>
                     <pic:cNvPicPr/>
                   </pic:nvPicPr>
                   <pic:blipFill>
@@ -2071,7 +2613,7 @@
                   <pic:spPr>
                     <a:xfrm>
                       <a:off x="0" y="0"/>
-                      <a:ext cx="6119495" cy="3651250"/>
+                      <a:ext cx="6119495" cy="3774440"/>
                     </a:xfrm>
                     <a:prstGeom prst="rect">
                       <a:avLst/>
@@ -2088,26 +2630,35 @@
     <w:p>
       <w:pPr>
         <w:pStyle w:val="Titolo2"/>
-      </w:pPr>
-      <w:r>
-        <w:lastRenderedPageBreak/>
-        <w:t xml:space="preserve">2.1 </w:t>
-      </w:r>
+        <w:numPr>
+          <w:ilvl w:val="1"/>
+          <w:numId w:val="8"/>
+        </w:numPr>
+      </w:pPr>
+      <w:bookmarkStart w:id="2" w:name="_Toc220753522"/>
       <w:r>
         <w:t>Descrizione tabelle</w:t>
       </w:r>
+      <w:bookmarkEnd w:id="2"/>
     </w:p>
     <w:p/>
     <w:p>
       <w:pPr>
         <w:pStyle w:val="Titolo3"/>
-      </w:pPr>
-      <w:r>
-        <w:t xml:space="preserve">2.1.1 </w:t>
-      </w:r>
+        <w:numPr>
+          <w:ilvl w:val="2"/>
+          <w:numId w:val="12"/>
+        </w:numPr>
+        <w:ind w:left="709" w:hanging="709"/>
+      </w:pPr>
+      <w:r>
+        <w:t xml:space="preserve"> </w:t>
+      </w:r>
+      <w:bookmarkStart w:id="3" w:name="_Toc220753523"/>
       <w:r>
         <w:t>Utente</w:t>
       </w:r>
+      <w:bookmarkEnd w:id="3"/>
     </w:p>
     <w:p/>
     <w:p>
@@ -2253,6 +2804,17 @@
       </w:r>
       <w:proofErr w:type="spellEnd"/>
       <w:r>
+        <w:t xml:space="preserve">, (rappresentato all’interno dello schema come </w:t>
+      </w:r>
+      <w:proofErr w:type="spellStart"/>
+      <w:r>
+        <w:t>tinyInt</w:t>
+      </w:r>
+      <w:proofErr w:type="spellEnd"/>
+      <w:r>
+        <w:t>)</w:t>
+      </w:r>
+      <w:r>
         <w:t xml:space="preserve"> </w:t>
       </w:r>
       <w:r>
@@ -2348,10 +2910,7 @@
         <w:t xml:space="preserve">del gestore, tuttavia, è solo una specializzazione teorica, a livello di implementazione non avrà effettivamente una tabella dedicata. Per le tabelle supervisore e dipendente, la tabella </w:t>
       </w:r>
       <w:r>
-        <w:t>supervisore</w:t>
-      </w:r>
-      <w:r>
-        <w:t xml:space="preserve"> </w:t>
+        <w:t xml:space="preserve">supervisore </w:t>
       </w:r>
       <w:r>
         <w:t>ha una relazione one-to-</w:t>
@@ -2386,13 +2945,15 @@
         <w:pStyle w:val="Titolo3"/>
         <w:numPr>
           <w:ilvl w:val="2"/>
-          <w:numId w:val="8"/>
+          <w:numId w:val="12"/>
         </w:numPr>
         <w:ind w:left="709"/>
       </w:pPr>
+      <w:bookmarkStart w:id="4" w:name="_Toc220753524"/>
       <w:r>
         <w:t>Task</w:t>
       </w:r>
+      <w:bookmarkEnd w:id="4"/>
     </w:p>
     <w:p/>
     <w:p>
@@ -2774,13 +3335,15 @@
         <w:pStyle w:val="Titolo3"/>
         <w:numPr>
           <w:ilvl w:val="2"/>
-          <w:numId w:val="8"/>
+          <w:numId w:val="12"/>
         </w:numPr>
         <w:ind w:left="709"/>
       </w:pPr>
+      <w:bookmarkStart w:id="5" w:name="_Toc220753525"/>
       <w:r>
         <w:t>Allegato</w:t>
       </w:r>
+      <w:bookmarkEnd w:id="5"/>
     </w:p>
     <w:p/>
     <w:p>
@@ -4219,6 +4782,127 @@
     </w:lvl>
   </w:abstractNum>
   <w:abstractNum w:abstractNumId="7" w15:restartNumberingAfterBreak="0">
+    <w:nsid w:val="626209F7"/>
+    <w:multiLevelType w:val="multilevel"/>
+    <w:tmpl w:val="57F81CC4"/>
+    <w:lvl w:ilvl="0">
+      <w:start w:val="2"/>
+      <w:numFmt w:val="decimal"/>
+      <w:lvlText w:val="%1."/>
+      <w:lvlJc w:val="left"/>
+      <w:pPr>
+        <w:ind w:left="720" w:hanging="360"/>
+      </w:pPr>
+      <w:rPr>
+        <w:rFonts w:hint="default"/>
+      </w:rPr>
+    </w:lvl>
+    <w:lvl w:ilvl="1">
+      <w:start w:val="1"/>
+      <w:numFmt w:val="decimal"/>
+      <w:isLgl/>
+      <w:lvlText w:val="%1.%2"/>
+      <w:lvlJc w:val="left"/>
+      <w:pPr>
+        <w:ind w:left="984" w:hanging="624"/>
+      </w:pPr>
+      <w:rPr>
+        <w:rFonts w:hint="default"/>
+      </w:rPr>
+    </w:lvl>
+    <w:lvl w:ilvl="2">
+      <w:start w:val="1"/>
+      <w:numFmt w:val="decimal"/>
+      <w:isLgl/>
+      <w:lvlText w:val="%1.%2.%3"/>
+      <w:lvlJc w:val="left"/>
+      <w:pPr>
+        <w:ind w:left="1430" w:hanging="720"/>
+      </w:pPr>
+      <w:rPr>
+        <w:rFonts w:hint="default"/>
+      </w:rPr>
+    </w:lvl>
+    <w:lvl w:ilvl="3">
+      <w:start w:val="1"/>
+      <w:numFmt w:val="decimal"/>
+      <w:isLgl/>
+      <w:lvlText w:val="%1.%2.%3.%4"/>
+      <w:lvlJc w:val="left"/>
+      <w:pPr>
+        <w:ind w:left="1080" w:hanging="720"/>
+      </w:pPr>
+      <w:rPr>
+        <w:rFonts w:hint="default"/>
+      </w:rPr>
+    </w:lvl>
+    <w:lvl w:ilvl="4">
+      <w:start w:val="1"/>
+      <w:numFmt w:val="decimal"/>
+      <w:isLgl/>
+      <w:lvlText w:val="%1.%2.%3.%4.%5"/>
+      <w:lvlJc w:val="left"/>
+      <w:pPr>
+        <w:ind w:left="1440" w:hanging="1080"/>
+      </w:pPr>
+      <w:rPr>
+        <w:rFonts w:hint="default"/>
+      </w:rPr>
+    </w:lvl>
+    <w:lvl w:ilvl="5">
+      <w:start w:val="1"/>
+      <w:numFmt w:val="decimal"/>
+      <w:isLgl/>
+      <w:lvlText w:val="%1.%2.%3.%4.%5.%6"/>
+      <w:lvlJc w:val="left"/>
+      <w:pPr>
+        <w:ind w:left="1440" w:hanging="1080"/>
+      </w:pPr>
+      <w:rPr>
+        <w:rFonts w:hint="default"/>
+      </w:rPr>
+    </w:lvl>
+    <w:lvl w:ilvl="6">
+      <w:start w:val="1"/>
+      <w:numFmt w:val="decimal"/>
+      <w:isLgl/>
+      <w:lvlText w:val="%1.%2.%3.%4.%5.%6.%7"/>
+      <w:lvlJc w:val="left"/>
+      <w:pPr>
+        <w:ind w:left="1800" w:hanging="1440"/>
+      </w:pPr>
+      <w:rPr>
+        <w:rFonts w:hint="default"/>
+      </w:rPr>
+    </w:lvl>
+    <w:lvl w:ilvl="7">
+      <w:start w:val="1"/>
+      <w:numFmt w:val="decimal"/>
+      <w:isLgl/>
+      <w:lvlText w:val="%1.%2.%3.%4.%5.%6.%7.%8"/>
+      <w:lvlJc w:val="left"/>
+      <w:pPr>
+        <w:ind w:left="1800" w:hanging="1440"/>
+      </w:pPr>
+      <w:rPr>
+        <w:rFonts w:hint="default"/>
+      </w:rPr>
+    </w:lvl>
+    <w:lvl w:ilvl="8">
+      <w:start w:val="1"/>
+      <w:numFmt w:val="decimal"/>
+      <w:isLgl/>
+      <w:lvlText w:val="%1.%2.%3.%4.%5.%6.%7.%8.%9"/>
+      <w:lvlJc w:val="left"/>
+      <w:pPr>
+        <w:ind w:left="2160" w:hanging="1800"/>
+      </w:pPr>
+      <w:rPr>
+        <w:rFonts w:hint="default"/>
+      </w:rPr>
+    </w:lvl>
+  </w:abstractNum>
+  <w:abstractNum w:abstractNumId="8" w15:restartNumberingAfterBreak="0">
     <w:nsid w:val="6D412EDD"/>
     <w:multiLevelType w:val="hybridMultilevel"/>
     <w:tmpl w:val="2ED64BC6"/>
@@ -4304,7 +4988,7 @@
       </w:pPr>
     </w:lvl>
   </w:abstractNum>
-  <w:abstractNum w:abstractNumId="8" w15:restartNumberingAfterBreak="0">
+  <w:abstractNum w:abstractNumId="9" w15:restartNumberingAfterBreak="0">
     <w:nsid w:val="73777F89"/>
     <w:multiLevelType w:val="hybridMultilevel"/>
     <w:tmpl w:val="DAC093B0"/>
@@ -4416,7 +5100,93 @@
       </w:rPr>
     </w:lvl>
   </w:abstractNum>
-  <w:abstractNum w:abstractNumId="9" w15:restartNumberingAfterBreak="0">
+  <w:abstractNum w:abstractNumId="10" w15:restartNumberingAfterBreak="0">
+    <w:nsid w:val="79E23206"/>
+    <w:multiLevelType w:val="hybridMultilevel"/>
+    <w:tmpl w:val="B114EE38"/>
+    <w:lvl w:ilvl="0" w:tplc="0410000F">
+      <w:start w:val="1"/>
+      <w:numFmt w:val="decimal"/>
+      <w:lvlText w:val="%1."/>
+      <w:lvlJc w:val="left"/>
+      <w:pPr>
+        <w:ind w:left="720" w:hanging="360"/>
+      </w:pPr>
+    </w:lvl>
+    <w:lvl w:ilvl="1" w:tplc="04100019" w:tentative="1">
+      <w:start w:val="1"/>
+      <w:numFmt w:val="lowerLetter"/>
+      <w:lvlText w:val="%2."/>
+      <w:lvlJc w:val="left"/>
+      <w:pPr>
+        <w:ind w:left="1440" w:hanging="360"/>
+      </w:pPr>
+    </w:lvl>
+    <w:lvl w:ilvl="2" w:tplc="0410001B" w:tentative="1">
+      <w:start w:val="1"/>
+      <w:numFmt w:val="lowerRoman"/>
+      <w:lvlText w:val="%3."/>
+      <w:lvlJc w:val="right"/>
+      <w:pPr>
+        <w:ind w:left="2160" w:hanging="180"/>
+      </w:pPr>
+    </w:lvl>
+    <w:lvl w:ilvl="3" w:tplc="0410000F" w:tentative="1">
+      <w:start w:val="1"/>
+      <w:numFmt w:val="decimal"/>
+      <w:lvlText w:val="%4."/>
+      <w:lvlJc w:val="left"/>
+      <w:pPr>
+        <w:ind w:left="2880" w:hanging="360"/>
+      </w:pPr>
+    </w:lvl>
+    <w:lvl w:ilvl="4" w:tplc="04100019" w:tentative="1">
+      <w:start w:val="1"/>
+      <w:numFmt w:val="lowerLetter"/>
+      <w:lvlText w:val="%5."/>
+      <w:lvlJc w:val="left"/>
+      <w:pPr>
+        <w:ind w:left="3600" w:hanging="360"/>
+      </w:pPr>
+    </w:lvl>
+    <w:lvl w:ilvl="5" w:tplc="0410001B" w:tentative="1">
+      <w:start w:val="1"/>
+      <w:numFmt w:val="lowerRoman"/>
+      <w:lvlText w:val="%6."/>
+      <w:lvlJc w:val="right"/>
+      <w:pPr>
+        <w:ind w:left="4320" w:hanging="180"/>
+      </w:pPr>
+    </w:lvl>
+    <w:lvl w:ilvl="6" w:tplc="0410000F" w:tentative="1">
+      <w:start w:val="1"/>
+      <w:numFmt w:val="decimal"/>
+      <w:lvlText w:val="%7."/>
+      <w:lvlJc w:val="left"/>
+      <w:pPr>
+        <w:ind w:left="5040" w:hanging="360"/>
+      </w:pPr>
+    </w:lvl>
+    <w:lvl w:ilvl="7" w:tplc="04100019" w:tentative="1">
+      <w:start w:val="1"/>
+      <w:numFmt w:val="lowerLetter"/>
+      <w:lvlText w:val="%8."/>
+      <w:lvlJc w:val="left"/>
+      <w:pPr>
+        <w:ind w:left="5760" w:hanging="360"/>
+      </w:pPr>
+    </w:lvl>
+    <w:lvl w:ilvl="8" w:tplc="0410001B" w:tentative="1">
+      <w:start w:val="1"/>
+      <w:numFmt w:val="lowerRoman"/>
+      <w:lvlText w:val="%9."/>
+      <w:lvlJc w:val="right"/>
+      <w:pPr>
+        <w:ind w:left="6480" w:hanging="180"/>
+      </w:pPr>
+    </w:lvl>
+  </w:abstractNum>
+  <w:abstractNum w:abstractNumId="11" w15:restartNumberingAfterBreak="0">
     <w:nsid w:val="7DBA18C3"/>
     <w:multiLevelType w:val="hybridMultilevel"/>
     <w:tmpl w:val="55622970"/>
@@ -4533,16 +5303,16 @@
     <w:abstractNumId w:val="1"/>
   </w:num>
   <w:num w:numId="2" w16cid:durableId="709258864">
-    <w:abstractNumId w:val="9"/>
+    <w:abstractNumId w:val="11"/>
   </w:num>
   <w:num w:numId="3" w16cid:durableId="2059426409">
     <w:abstractNumId w:val="3"/>
   </w:num>
   <w:num w:numId="4" w16cid:durableId="1142649016">
-    <w:abstractNumId w:val="7"/>
+    <w:abstractNumId w:val="8"/>
   </w:num>
   <w:num w:numId="5" w16cid:durableId="611784743">
-    <w:abstractNumId w:val="8"/>
+    <w:abstractNumId w:val="9"/>
   </w:num>
   <w:num w:numId="6" w16cid:durableId="894001301">
     <w:abstractNumId w:val="0"/>
@@ -4558,6 +5328,12 @@
   </w:num>
   <w:num w:numId="10" w16cid:durableId="2108034299">
     <w:abstractNumId w:val="6"/>
+  </w:num>
+  <w:num w:numId="11" w16cid:durableId="258954215">
+    <w:abstractNumId w:val="10"/>
+  </w:num>
+  <w:num w:numId="12" w16cid:durableId="1878203966">
+    <w:abstractNumId w:val="7"/>
   </w:num>
 </w:numbering>
 </file>
@@ -5167,6 +5943,7 @@
   <w:style w:type="character" w:default="1" w:styleId="Carpredefinitoparagrafo">
     <w:name w:val="Default Paragraph Font"/>
     <w:uiPriority w:val="1"/>
+    <w:semiHidden/>
     <w:unhideWhenUsed/>
   </w:style>
   <w:style w:type="table" w:default="1" w:styleId="Tabellanormale">
@@ -5679,6 +6456,19 @@
       <w:u w:val="single"/>
     </w:rPr>
   </w:style>
+  <w:style w:type="paragraph" w:styleId="Sommario3">
+    <w:name w:val="toc 3"/>
+    <w:basedOn w:val="Normale"/>
+    <w:next w:val="Normale"/>
+    <w:autoRedefine/>
+    <w:uiPriority w:val="39"/>
+    <w:unhideWhenUsed/>
+    <w:rsid w:val="00285C66"/>
+    <w:pPr>
+      <w:spacing w:after="100"/>
+      <w:ind w:left="480"/>
+    </w:pPr>
+  </w:style>
 </w:styles>
 </file>
 

</xml_diff>

<commit_message>
Mod: modifica e controllo di tutti i documenti
</commit_message>
<xml_diff>
--- a/Workspace/SDD/DBI_EWMS.docx
+++ b/Workspace/SDD/DBI_EWMS.docx
@@ -1900,7 +1900,7 @@
       <w:r>
         <w:fldChar w:fldCharType="separate"/>
       </w:r>
-      <w:hyperlink w:anchor="_Toc220753520" w:history="1">
+      <w:hyperlink w:anchor="_Toc221558580" w:history="1">
         <w:r>
           <w:rPr>
             <w:rStyle w:val="Collegamentoipertestuale"/>
@@ -1944,7 +1944,7 @@
             <w:noProof/>
             <w:webHidden/>
           </w:rPr>
-          <w:instrText xml:space="preserve"> PAGEREF _Toc220753520 \h </w:instrText>
+          <w:instrText xml:space="preserve"> PAGEREF _Toc221558580 \h </w:instrText>
         </w:r>
         <w:r>
           <w:rPr>
@@ -1989,7 +1989,7 @@
           <w14:ligatures w14:val="standardContextual"/>
         </w:rPr>
       </w:pPr>
-      <w:hyperlink w:anchor="_Toc220753521" w:history="1">
+      <w:hyperlink w:anchor="_Toc221558581" w:history="1">
         <w:r>
           <w:rPr>
             <w:rStyle w:val="Collegamentoipertestuale"/>
@@ -2033,7 +2033,7 @@
             <w:noProof/>
             <w:webHidden/>
           </w:rPr>
-          <w:instrText xml:space="preserve"> PAGEREF _Toc220753521 \h </w:instrText>
+          <w:instrText xml:space="preserve"> PAGEREF _Toc221558581 \h </w:instrText>
         </w:r>
         <w:r>
           <w:rPr>
@@ -2078,7 +2078,7 @@
           <w14:ligatures w14:val="standardContextual"/>
         </w:rPr>
       </w:pPr>
-      <w:hyperlink w:anchor="_Toc220753522" w:history="1">
+      <w:hyperlink w:anchor="_Toc221558582" w:history="1">
         <w:r>
           <w:rPr>
             <w:rStyle w:val="Collegamentoipertestuale"/>
@@ -2122,7 +2122,7 @@
             <w:noProof/>
             <w:webHidden/>
           </w:rPr>
-          <w:instrText xml:space="preserve"> PAGEREF _Toc220753522 \h </w:instrText>
+          <w:instrText xml:space="preserve"> PAGEREF _Toc221558582 \h </w:instrText>
         </w:r>
         <w:r>
           <w:rPr>
@@ -2167,7 +2167,7 @@
           <w:lang w:eastAsia="it-IT"/>
         </w:rPr>
       </w:pPr>
-      <w:hyperlink w:anchor="_Toc220753523" w:history="1">
+      <w:hyperlink w:anchor="_Toc221558583" w:history="1">
         <w:r>
           <w:rPr>
             <w:rStyle w:val="Collegamentoipertestuale"/>
@@ -2210,7 +2210,7 @@
             <w:noProof/>
             <w:webHidden/>
           </w:rPr>
-          <w:instrText xml:space="preserve"> PAGEREF _Toc220753523 \h </w:instrText>
+          <w:instrText xml:space="preserve"> PAGEREF _Toc221558583 \h </w:instrText>
         </w:r>
         <w:r>
           <w:rPr>
@@ -2255,7 +2255,7 @@
           <w:lang w:eastAsia="it-IT"/>
         </w:rPr>
       </w:pPr>
-      <w:hyperlink w:anchor="_Toc220753524" w:history="1">
+      <w:hyperlink w:anchor="_Toc221558584" w:history="1">
         <w:r>
           <w:rPr>
             <w:rStyle w:val="Collegamentoipertestuale"/>
@@ -2298,7 +2298,7 @@
             <w:noProof/>
             <w:webHidden/>
           </w:rPr>
-          <w:instrText xml:space="preserve"> PAGEREF _Toc220753524 \h </w:instrText>
+          <w:instrText xml:space="preserve"> PAGEREF _Toc221558584 \h </w:instrText>
         </w:r>
         <w:r>
           <w:rPr>
@@ -2343,7 +2343,7 @@
           <w:lang w:eastAsia="it-IT"/>
         </w:rPr>
       </w:pPr>
-      <w:hyperlink w:anchor="_Toc220753525" w:history="1">
+      <w:hyperlink w:anchor="_Toc221558585" w:history="1">
         <w:r>
           <w:rPr>
             <w:rStyle w:val="Collegamentoipertestuale"/>
@@ -2386,7 +2386,7 @@
             <w:noProof/>
             <w:webHidden/>
           </w:rPr>
-          <w:instrText xml:space="preserve"> PAGEREF _Toc220753525 \h </w:instrText>
+          <w:instrText xml:space="preserve"> PAGEREF _Toc221558585 \h </w:instrText>
         </w:r>
         <w:r>
           <w:rPr>
@@ -2418,6 +2418,94 @@
       </w:hyperlink>
     </w:p>
     <w:p>
+      <w:pPr>
+        <w:pStyle w:val="Sommario3"/>
+        <w:tabs>
+          <w:tab w:val="left" w:pos="1440"/>
+          <w:tab w:val="right" w:leader="dot" w:pos="9627"/>
+        </w:tabs>
+        <w:rPr>
+          <w:rFonts w:asciiTheme="minorHAnsi" w:eastAsiaTheme="minorEastAsia" w:hAnsiTheme="minorHAnsi"/>
+          <w:noProof/>
+          <w:szCs w:val="24"/>
+          <w:lang w:eastAsia="it-IT"/>
+        </w:rPr>
+      </w:pPr>
+      <w:hyperlink w:anchor="_Toc221558586" w:history="1">
+        <w:r>
+          <w:rPr>
+            <w:rStyle w:val="Collegamentoipertestuale"/>
+            <w:noProof/>
+          </w:rPr>
+          <w:t>2.1.4</w:t>
+        </w:r>
+        <w:r>
+          <w:rPr>
+            <w:rFonts w:asciiTheme="minorHAnsi" w:eastAsiaTheme="minorEastAsia" w:hAnsiTheme="minorHAnsi"/>
+            <w:noProof/>
+            <w:szCs w:val="24"/>
+            <w:lang w:eastAsia="it-IT"/>
+          </w:rPr>
+          <w:tab/>
+        </w:r>
+        <w:r>
+          <w:rPr>
+            <w:rStyle w:val="Collegamentoipertestuale"/>
+            <w:noProof/>
+          </w:rPr>
+          <w:t>Notifica</w:t>
+        </w:r>
+        <w:r>
+          <w:rPr>
+            <w:noProof/>
+            <w:webHidden/>
+          </w:rPr>
+          <w:tab/>
+        </w:r>
+        <w:r>
+          <w:rPr>
+            <w:noProof/>
+            <w:webHidden/>
+          </w:rPr>
+          <w:fldChar w:fldCharType="begin"/>
+        </w:r>
+        <w:r>
+          <w:rPr>
+            <w:noProof/>
+            <w:webHidden/>
+          </w:rPr>
+          <w:instrText xml:space="preserve"> PAGEREF _Toc221558586 \h </w:instrText>
+        </w:r>
+        <w:r>
+          <w:rPr>
+            <w:noProof/>
+            <w:webHidden/>
+          </w:rPr>
+        </w:r>
+        <w:r>
+          <w:rPr>
+            <w:noProof/>
+            <w:webHidden/>
+          </w:rPr>
+          <w:fldChar w:fldCharType="separate"/>
+        </w:r>
+        <w:r>
+          <w:rPr>
+            <w:noProof/>
+            <w:webHidden/>
+          </w:rPr>
+          <w:t>7</w:t>
+        </w:r>
+        <w:r>
+          <w:rPr>
+            <w:noProof/>
+            <w:webHidden/>
+          </w:rPr>
+          <w:fldChar w:fldCharType="end"/>
+        </w:r>
+      </w:hyperlink>
+    </w:p>
+    <w:p>
       <w:r>
         <w:rPr>
           <w:b/>
@@ -2462,7 +2550,7 @@
         </w:numPr>
         <w:ind w:left="142"/>
       </w:pPr>
-      <w:bookmarkStart w:id="0" w:name="_Toc220753520"/>
+      <w:bookmarkStart w:id="0" w:name="_Toc221558580"/>
       <w:r>
         <w:lastRenderedPageBreak/>
         <w:t>Introduzione</w:t>
@@ -2571,7 +2659,7 @@
         </w:numPr>
         <w:ind w:left="142"/>
       </w:pPr>
-      <w:bookmarkStart w:id="1" w:name="_Toc220753521"/>
+      <w:bookmarkStart w:id="1" w:name="_Toc221558581"/>
       <w:r>
         <w:t>Descrizione Database</w:t>
       </w:r>
@@ -2636,7 +2724,7 @@
         </w:numPr>
         <w:ind w:left="567"/>
       </w:pPr>
-      <w:bookmarkStart w:id="2" w:name="_Toc220753522"/>
+      <w:bookmarkStart w:id="2" w:name="_Toc221558582"/>
       <w:r>
         <w:lastRenderedPageBreak/>
         <w:t>Descrizione tabelle</w:t>
@@ -2656,7 +2744,7 @@
       <w:r>
         <w:t xml:space="preserve"> </w:t>
       </w:r>
-      <w:bookmarkStart w:id="3" w:name="_Toc220753523"/>
+      <w:bookmarkStart w:id="3" w:name="_Toc221558583"/>
       <w:r>
         <w:t>Utente</w:t>
       </w:r>
@@ -2976,7 +3064,7 @@
         </w:numPr>
         <w:ind w:left="709"/>
       </w:pPr>
-      <w:bookmarkStart w:id="4" w:name="_Toc220753524"/>
+      <w:bookmarkStart w:id="4" w:name="_Toc221558584"/>
       <w:r>
         <w:t>Task</w:t>
       </w:r>
@@ -3369,7 +3457,7 @@
         </w:numPr>
         <w:ind w:left="709"/>
       </w:pPr>
-      <w:bookmarkStart w:id="5" w:name="_Toc220753525"/>
+      <w:bookmarkStart w:id="5" w:name="_Toc221558585"/>
       <w:r>
         <w:t>Allegato</w:t>
       </w:r>
@@ -3621,9 +3709,11 @@
         </w:numPr>
         <w:ind w:left="709"/>
       </w:pPr>
+      <w:bookmarkStart w:id="6" w:name="_Toc221558586"/>
       <w:r>
         <w:t>Notifica</w:t>
       </w:r>
+      <w:bookmarkEnd w:id="6"/>
     </w:p>
     <w:p/>
     <w:p>
@@ -6476,6 +6566,7 @@
   <w:style w:type="character" w:default="1" w:styleId="Carpredefinitoparagrafo">
     <w:name w:val="Default Paragraph Font"/>
     <w:uiPriority w:val="1"/>
+    <w:semiHidden/>
     <w:unhideWhenUsed/>
   </w:style>
   <w:style w:type="table" w:default="1" w:styleId="Tabellanormale">

</xml_diff>